<commit_message>
Update logic topic score
</commit_message>
<xml_diff>
--- a/src/templates/NIIE-KLTN013.docx
+++ b/src/templates/NIIE-KLTN013.docx
@@ -609,18 +609,18 @@
         <w:tblLook w:val="04A0" w:firstRow="1" w:lastRow="0" w:firstColumn="1" w:lastColumn="0" w:noHBand="0" w:noVBand="1"/>
       </w:tblPr>
       <w:tblGrid>
-        <w:gridCol w:w="374"/>
-        <w:gridCol w:w="1050"/>
-        <w:gridCol w:w="859"/>
-        <w:gridCol w:w="1350"/>
-        <w:gridCol w:w="1383"/>
-        <w:gridCol w:w="1196"/>
-        <w:gridCol w:w="1116"/>
-        <w:gridCol w:w="1716"/>
-        <w:gridCol w:w="1716"/>
-        <w:gridCol w:w="1716"/>
-        <w:gridCol w:w="1169"/>
-        <w:gridCol w:w="1200"/>
+        <w:gridCol w:w="931"/>
+        <w:gridCol w:w="968"/>
+        <w:gridCol w:w="792"/>
+        <w:gridCol w:w="1241"/>
+        <w:gridCol w:w="1271"/>
+        <w:gridCol w:w="1100"/>
+        <w:gridCol w:w="1020"/>
+        <w:gridCol w:w="1575"/>
+        <w:gridCol w:w="1575"/>
+        <w:gridCol w:w="1575"/>
+        <w:gridCol w:w="1075"/>
+        <w:gridCol w:w="1722"/>
       </w:tblGrid>
       <w:tr>
         <w:trPr>
@@ -628,7 +628,7 @@
         </w:trPr>
         <w:tc>
           <w:tcPr>
-            <w:tcW w:w="130" w:type="pct"/>
+            <w:tcW w:w="314" w:type="pct"/>
             <w:vMerge w:val="restart"/>
             <w:tcBorders>
               <w:top w:val="single" w:sz="4" w:space="0" w:color="auto"/>
@@ -674,7 +674,7 @@
         </w:tc>
         <w:tc>
           <w:tcPr>
-            <w:tcW w:w="367" w:type="pct"/>
+            <w:tcW w:w="326" w:type="pct"/>
             <w:vMerge w:val="restart"/>
             <w:tcBorders>
               <w:top w:val="single" w:sz="4" w:space="0" w:color="auto"/>
@@ -720,7 +720,7 @@
         </w:tc>
         <w:tc>
           <w:tcPr>
-            <w:tcW w:w="300" w:type="pct"/>
+            <w:tcW w:w="267" w:type="pct"/>
             <w:vMerge w:val="restart"/>
             <w:tcBorders>
               <w:top w:val="single" w:sz="4" w:space="0" w:color="auto"/>
@@ -766,7 +766,7 @@
         </w:tc>
         <w:tc>
           <w:tcPr>
-            <w:tcW w:w="473" w:type="pct"/>
+            <w:tcW w:w="418" w:type="pct"/>
             <w:vMerge w:val="restart"/>
             <w:tcBorders>
               <w:top w:val="single" w:sz="4" w:space="0" w:color="auto"/>
@@ -812,7 +812,7 @@
         </w:tc>
         <w:tc>
           <w:tcPr>
-            <w:tcW w:w="485" w:type="pct"/>
+            <w:tcW w:w="428" w:type="pct"/>
             <w:vMerge w:val="restart"/>
             <w:tcBorders>
               <w:top w:val="single" w:sz="4" w:space="0" w:color="auto"/>
@@ -858,7 +858,7 @@
         </w:tc>
         <w:tc>
           <w:tcPr>
-            <w:tcW w:w="3245" w:type="pct"/>
+            <w:tcW w:w="3248" w:type="pct"/>
             <w:gridSpan w:val="7"/>
             <w:tcBorders>
               <w:top w:val="single" w:sz="4" w:space="0" w:color="auto"/>
@@ -909,7 +909,7 @@
         </w:trPr>
         <w:tc>
           <w:tcPr>
-            <w:tcW w:w="130" w:type="pct"/>
+            <w:tcW w:w="314" w:type="pct"/>
             <w:vMerge/>
             <w:tcBorders>
               <w:left w:val="single" w:sz="4" w:space="0" w:color="auto"/>
@@ -942,7 +942,7 @@
         </w:tc>
         <w:tc>
           <w:tcPr>
-            <w:tcW w:w="367" w:type="pct"/>
+            <w:tcW w:w="326" w:type="pct"/>
             <w:vMerge/>
             <w:tcBorders>
               <w:left w:val="single" w:sz="4" w:space="0" w:color="auto"/>
@@ -975,7 +975,7 @@
         </w:tc>
         <w:tc>
           <w:tcPr>
-            <w:tcW w:w="300" w:type="pct"/>
+            <w:tcW w:w="267" w:type="pct"/>
             <w:vMerge/>
             <w:tcBorders>
               <w:left w:val="single" w:sz="4" w:space="0" w:color="auto"/>
@@ -1008,7 +1008,7 @@
         </w:tc>
         <w:tc>
           <w:tcPr>
-            <w:tcW w:w="473" w:type="pct"/>
+            <w:tcW w:w="418" w:type="pct"/>
             <w:vMerge/>
             <w:tcBorders>
               <w:left w:val="single" w:sz="4" w:space="0" w:color="auto"/>
@@ -1041,7 +1041,7 @@
         </w:tc>
         <w:tc>
           <w:tcPr>
-            <w:tcW w:w="485" w:type="pct"/>
+            <w:tcW w:w="428" w:type="pct"/>
             <w:vMerge/>
             <w:tcBorders>
               <w:left w:val="single" w:sz="4" w:space="0" w:color="auto"/>
@@ -1074,7 +1074,7 @@
         </w:tc>
         <w:tc>
           <w:tcPr>
-            <w:tcW w:w="419" w:type="pct"/>
+            <w:tcW w:w="370" w:type="pct"/>
             <w:vMerge w:val="restart"/>
             <w:tcBorders>
               <w:top w:val="single" w:sz="4" w:space="0" w:color="auto"/>
@@ -1120,7 +1120,7 @@
         </w:tc>
         <w:tc>
           <w:tcPr>
-            <w:tcW w:w="392" w:type="pct"/>
+            <w:tcW w:w="344" w:type="pct"/>
             <w:vMerge w:val="restart"/>
             <w:tcBorders>
               <w:top w:val="single" w:sz="4" w:space="0" w:color="auto"/>
@@ -1160,7 +1160,7 @@
         </w:tc>
         <w:tc>
           <w:tcPr>
-            <w:tcW w:w="1805" w:type="pct"/>
+            <w:tcW w:w="1591" w:type="pct"/>
             <w:gridSpan w:val="3"/>
             <w:tcBorders>
               <w:top w:val="single" w:sz="4" w:space="0" w:color="auto"/>
@@ -1207,7 +1207,7 @@
         </w:tc>
         <w:tc>
           <w:tcPr>
-            <w:tcW w:w="629" w:type="pct"/>
+            <w:tcW w:w="942" w:type="pct"/>
             <w:gridSpan w:val="2"/>
             <w:vMerge w:val="restart"/>
             <w:tcBorders>
@@ -1259,7 +1259,7 @@
         </w:trPr>
         <w:tc>
           <w:tcPr>
-            <w:tcW w:w="130" w:type="pct"/>
+            <w:tcW w:w="314" w:type="pct"/>
             <w:vMerge/>
             <w:tcBorders>
               <w:left w:val="single" w:sz="4" w:space="0" w:color="auto"/>
@@ -1293,7 +1293,7 @@
         </w:tc>
         <w:tc>
           <w:tcPr>
-            <w:tcW w:w="367" w:type="pct"/>
+            <w:tcW w:w="326" w:type="pct"/>
             <w:vMerge/>
             <w:tcBorders>
               <w:left w:val="single" w:sz="4" w:space="0" w:color="auto"/>
@@ -1327,7 +1327,7 @@
         </w:tc>
         <w:tc>
           <w:tcPr>
-            <w:tcW w:w="300" w:type="pct"/>
+            <w:tcW w:w="267" w:type="pct"/>
             <w:vMerge/>
             <w:tcBorders>
               <w:left w:val="single" w:sz="4" w:space="0" w:color="auto"/>
@@ -1361,7 +1361,7 @@
         </w:tc>
         <w:tc>
           <w:tcPr>
-            <w:tcW w:w="473" w:type="pct"/>
+            <w:tcW w:w="418" w:type="pct"/>
             <w:vMerge/>
             <w:tcBorders>
               <w:left w:val="single" w:sz="4" w:space="0" w:color="auto"/>
@@ -1395,7 +1395,7 @@
         </w:tc>
         <w:tc>
           <w:tcPr>
-            <w:tcW w:w="485" w:type="pct"/>
+            <w:tcW w:w="428" w:type="pct"/>
             <w:vMerge/>
             <w:tcBorders>
               <w:left w:val="single" w:sz="4" w:space="0" w:color="auto"/>
@@ -1429,7 +1429,7 @@
         </w:tc>
         <w:tc>
           <w:tcPr>
-            <w:tcW w:w="419" w:type="pct"/>
+            <w:tcW w:w="370" w:type="pct"/>
             <w:vMerge/>
             <w:tcBorders>
               <w:left w:val="single" w:sz="4" w:space="0" w:color="auto"/>
@@ -1463,7 +1463,7 @@
         </w:tc>
         <w:tc>
           <w:tcPr>
-            <w:tcW w:w="392" w:type="pct"/>
+            <w:tcW w:w="344" w:type="pct"/>
             <w:vMerge/>
             <w:tcBorders>
               <w:left w:val="single" w:sz="4" w:space="0" w:color="auto"/>
@@ -1490,7 +1490,7 @@
         </w:tc>
         <w:tc>
           <w:tcPr>
-            <w:tcW w:w="602" w:type="pct"/>
+            <w:tcW w:w="530" w:type="pct"/>
             <w:vMerge w:val="restart"/>
             <w:tcBorders>
               <w:top w:val="single" w:sz="4" w:space="0" w:color="auto"/>
@@ -1560,7 +1560,7 @@
         </w:tc>
         <w:tc>
           <w:tcPr>
-            <w:tcW w:w="602" w:type="pct"/>
+            <w:tcW w:w="530" w:type="pct"/>
             <w:vMerge w:val="restart"/>
             <w:tcBorders>
               <w:top w:val="single" w:sz="4" w:space="0" w:color="auto"/>
@@ -1627,7 +1627,7 @@
         </w:tc>
         <w:tc>
           <w:tcPr>
-            <w:tcW w:w="602" w:type="pct"/>
+            <w:tcW w:w="530" w:type="pct"/>
             <w:vMerge w:val="restart"/>
             <w:tcBorders>
               <w:top w:val="single" w:sz="4" w:space="0" w:color="auto"/>
@@ -1694,7 +1694,7 @@
         </w:tc>
         <w:tc>
           <w:tcPr>
-            <w:tcW w:w="629" w:type="pct"/>
+            <w:tcW w:w="942" w:type="pct"/>
             <w:gridSpan w:val="2"/>
             <w:vMerge/>
             <w:tcBorders>
@@ -1735,7 +1735,7 @@
         </w:trPr>
         <w:tc>
           <w:tcPr>
-            <w:tcW w:w="130" w:type="pct"/>
+            <w:tcW w:w="314" w:type="pct"/>
             <w:vMerge/>
             <w:tcBorders>
               <w:left w:val="single" w:sz="4" w:space="0" w:color="auto"/>
@@ -1767,7 +1767,7 @@
         </w:tc>
         <w:tc>
           <w:tcPr>
-            <w:tcW w:w="367" w:type="pct"/>
+            <w:tcW w:w="326" w:type="pct"/>
             <w:vMerge/>
             <w:tcBorders>
               <w:left w:val="single" w:sz="4" w:space="0" w:color="auto"/>
@@ -1798,7 +1798,7 @@
         </w:tc>
         <w:tc>
           <w:tcPr>
-            <w:tcW w:w="300" w:type="pct"/>
+            <w:tcW w:w="267" w:type="pct"/>
             <w:vMerge/>
             <w:tcBorders>
               <w:left w:val="single" w:sz="4" w:space="0" w:color="auto"/>
@@ -1831,7 +1831,7 @@
         </w:tc>
         <w:tc>
           <w:tcPr>
-            <w:tcW w:w="473" w:type="pct"/>
+            <w:tcW w:w="418" w:type="pct"/>
             <w:vMerge/>
             <w:tcBorders>
               <w:left w:val="single" w:sz="4" w:space="0" w:color="auto"/>
@@ -1862,7 +1862,7 @@
         </w:tc>
         <w:tc>
           <w:tcPr>
-            <w:tcW w:w="485" w:type="pct"/>
+            <w:tcW w:w="428" w:type="pct"/>
             <w:vMerge/>
             <w:tcBorders>
               <w:left w:val="single" w:sz="4" w:space="0" w:color="auto"/>
@@ -1893,7 +1893,7 @@
         </w:tc>
         <w:tc>
           <w:tcPr>
-            <w:tcW w:w="419" w:type="pct"/>
+            <w:tcW w:w="370" w:type="pct"/>
             <w:vMerge/>
             <w:tcBorders>
               <w:left w:val="single" w:sz="4" w:space="0" w:color="auto"/>
@@ -1925,7 +1925,7 @@
         </w:tc>
         <w:tc>
           <w:tcPr>
-            <w:tcW w:w="392" w:type="pct"/>
+            <w:tcW w:w="344" w:type="pct"/>
             <w:vMerge/>
             <w:tcBorders>
               <w:left w:val="single" w:sz="4" w:space="0" w:color="auto"/>
@@ -1951,7 +1951,7 @@
         </w:tc>
         <w:tc>
           <w:tcPr>
-            <w:tcW w:w="602" w:type="pct"/>
+            <w:tcW w:w="530" w:type="pct"/>
             <w:vMerge/>
             <w:tcBorders>
               <w:top w:val="single" w:sz="4" w:space="0" w:color="auto"/>
@@ -1984,7 +1984,7 @@
         </w:tc>
         <w:tc>
           <w:tcPr>
-            <w:tcW w:w="602" w:type="pct"/>
+            <w:tcW w:w="530" w:type="pct"/>
             <w:vMerge/>
             <w:tcBorders>
               <w:top w:val="single" w:sz="4" w:space="0" w:color="auto"/>
@@ -2017,7 +2017,7 @@
         </w:tc>
         <w:tc>
           <w:tcPr>
-            <w:tcW w:w="602" w:type="pct"/>
+            <w:tcW w:w="530" w:type="pct"/>
             <w:vMerge/>
             <w:tcBorders>
               <w:top w:val="single" w:sz="4" w:space="0" w:color="auto"/>
@@ -2050,7 +2050,7 @@
         </w:tc>
         <w:tc>
           <w:tcPr>
-            <w:tcW w:w="479" w:type="pct"/>
+            <w:tcW w:w="362" w:type="pct"/>
             <w:tcBorders>
               <w:top w:val="single" w:sz="4" w:space="0" w:color="auto"/>
               <w:left w:val="single" w:sz="4" w:space="0" w:color="auto"/>
@@ -2096,7 +2096,7 @@
         </w:tc>
         <w:tc>
           <w:tcPr>
-            <w:tcW w:w="151" w:type="pct"/>
+            <w:tcW w:w="580" w:type="pct"/>
             <w:tcBorders>
               <w:top w:val="single" w:sz="4" w:space="0" w:color="auto"/>
               <w:left w:val="single" w:sz="4" w:space="0" w:color="auto"/>
@@ -2147,7 +2147,7 @@
         </w:trPr>
         <w:tc>
           <w:tcPr>
-            <w:tcW w:w="130" w:type="pct"/>
+            <w:tcW w:w="314" w:type="pct"/>
             <w:tcBorders>
               <w:top w:val="single" w:sz="4" w:space="0" w:color="auto"/>
               <w:left w:val="single" w:sz="4" w:space="0" w:color="auto"/>
@@ -2183,13 +2183,13 @@
                 <w:szCs w:val="24"/>
                 <w14:ligatures w14:val="none"/>
               </w:rPr>
-              <w:t>1</w:t>
-            </w:r>
-          </w:p>
-        </w:tc>
-        <w:tc>
-          <w:tcPr>
-            <w:tcW w:w="367" w:type="pct"/>
+              <w:t>{#students}{stt}</w:t>
+            </w:r>
+          </w:p>
+        </w:tc>
+        <w:tc>
+          <w:tcPr>
+            <w:tcW w:w="326" w:type="pct"/>
             <w:tcBorders>
               <w:top w:val="single" w:sz="4" w:space="0" w:color="auto"/>
               <w:left w:val="single" w:sz="4" w:space="0" w:color="auto"/>
@@ -2230,7 +2230,7 @@
         </w:tc>
         <w:tc>
           <w:tcPr>
-            <w:tcW w:w="300" w:type="pct"/>
+            <w:tcW w:w="267" w:type="pct"/>
             <w:tcBorders>
               <w:top w:val="single" w:sz="4" w:space="0" w:color="auto"/>
               <w:left w:val="single" w:sz="4" w:space="0" w:color="auto"/>
@@ -2273,7 +2273,7 @@
         </w:tc>
         <w:tc>
           <w:tcPr>
-            <w:tcW w:w="473" w:type="pct"/>
+            <w:tcW w:w="418" w:type="pct"/>
             <w:tcBorders>
               <w:top w:val="single" w:sz="4" w:space="0" w:color="auto"/>
               <w:left w:val="single" w:sz="4" w:space="0" w:color="auto"/>
@@ -2313,7 +2313,7 @@
         </w:tc>
         <w:tc>
           <w:tcPr>
-            <w:tcW w:w="485" w:type="pct"/>
+            <w:tcW w:w="428" w:type="pct"/>
             <w:tcBorders>
               <w:top w:val="single" w:sz="4" w:space="0" w:color="auto"/>
               <w:left w:val="single" w:sz="4" w:space="0" w:color="auto"/>
@@ -2353,7 +2353,7 @@
         </w:tc>
         <w:tc>
           <w:tcPr>
-            <w:tcW w:w="419" w:type="pct"/>
+            <w:tcW w:w="370" w:type="pct"/>
             <w:tcBorders>
               <w:top w:val="single" w:sz="4" w:space="0" w:color="auto"/>
               <w:left w:val="single" w:sz="4" w:space="0" w:color="auto"/>
@@ -2403,7 +2403,7 @@
         </w:tc>
         <w:tc>
           <w:tcPr>
-            <w:tcW w:w="392" w:type="pct"/>
+            <w:tcW w:w="344" w:type="pct"/>
             <w:tcBorders>
               <w:top w:val="single" w:sz="4" w:space="0" w:color="auto"/>
               <w:left w:val="single" w:sz="4" w:space="0" w:color="auto"/>
@@ -2448,7 +2448,7 @@
         </w:tc>
         <w:tc>
           <w:tcPr>
-            <w:tcW w:w="602" w:type="pct"/>
+            <w:tcW w:w="530" w:type="pct"/>
             <w:tcBorders>
               <w:top w:val="single" w:sz="4" w:space="0" w:color="auto"/>
               <w:left w:val="single" w:sz="4" w:space="0" w:color="auto"/>
@@ -2499,7 +2499,7 @@
         </w:tc>
         <w:tc>
           <w:tcPr>
-            <w:tcW w:w="602" w:type="pct"/>
+            <w:tcW w:w="530" w:type="pct"/>
             <w:tcBorders>
               <w:top w:val="single" w:sz="4" w:space="0" w:color="auto"/>
               <w:left w:val="single" w:sz="4" w:space="0" w:color="auto"/>
@@ -2550,7 +2550,7 @@
         </w:tc>
         <w:tc>
           <w:tcPr>
-            <w:tcW w:w="602" w:type="pct"/>
+            <w:tcW w:w="530" w:type="pct"/>
             <w:tcBorders>
               <w:top w:val="single" w:sz="4" w:space="0" w:color="auto"/>
               <w:left w:val="single" w:sz="4" w:space="0" w:color="auto"/>
@@ -2601,7 +2601,7 @@
         </w:tc>
         <w:tc>
           <w:tcPr>
-            <w:tcW w:w="479" w:type="pct"/>
+            <w:tcW w:w="362" w:type="pct"/>
             <w:tcBorders>
               <w:top w:val="single" w:sz="4" w:space="0" w:color="auto"/>
               <w:left w:val="single" w:sz="4" w:space="0" w:color="auto"/>
@@ -2653,7 +2653,7 @@
         </w:tc>
         <w:tc>
           <w:tcPr>
-            <w:tcW w:w="151" w:type="pct"/>
+            <w:tcW w:w="580" w:type="pct"/>
             <w:tcBorders>
               <w:top w:val="single" w:sz="4" w:space="0" w:color="auto"/>
               <w:left w:val="single" w:sz="4" w:space="0" w:color="auto"/>
@@ -2688,1413 +2688,28 @@
                 <w:szCs w:val="26"/>
                 <w14:ligatures w14:val="none"/>
               </w:rPr>
-              <w:t>{final_score_text}</w:t>
-            </w:r>
-          </w:p>
-        </w:tc>
-      </w:tr>
-      <w:tr>
-        <w:trPr>
-          <w:trHeight w:val="795"/>
-        </w:trPr>
-        <w:tc>
-          <w:tcPr>
-            <w:tcW w:w="130" w:type="pct"/>
-            <w:tcBorders>
-              <w:top w:val="single" w:sz="4" w:space="0" w:color="auto"/>
-              <w:left w:val="single" w:sz="4" w:space="0" w:color="auto"/>
-              <w:bottom w:val="single" w:sz="4" w:space="0" w:color="auto"/>
-              <w:right w:val="single" w:sz="4" w:space="0" w:color="auto"/>
-            </w:tcBorders>
-            <w:tcMar>
-              <w:top w:w="0" w:type="dxa"/>
-              <w:left w:w="45" w:type="dxa"/>
-              <w:bottom w:w="0" w:type="dxa"/>
-              <w:right w:w="45" w:type="dxa"/>
-            </w:tcMar>
-            <w:vAlign w:val="center"/>
-          </w:tcPr>
-          <w:p>
-            <w:pPr>
-              <w:spacing w:after="0" w:line="240" w:lineRule="auto"/>
-              <w:jc w:val="center"/>
-              <w:rPr>
-                <w:rFonts w:ascii="Times New Roman" w:eastAsia="Times New Roman" w:hAnsi="Times New Roman" w:cs="Times New Roman"/>
-                <w:kern w:val="0"/>
-                <w:sz w:val="24"/>
-                <w:szCs w:val="24"/>
-                <w14:ligatures w14:val="none"/>
-              </w:rPr>
-            </w:pPr>
-            <w:r>
-              <w:rPr>
-                <w:rFonts w:ascii="Times New Roman" w:eastAsia="Times New Roman" w:hAnsi="Times New Roman" w:cs="Times New Roman"/>
-                <w:kern w:val="0"/>
-                <w:sz w:val="24"/>
-                <w:szCs w:val="24"/>
-                <w14:ligatures w14:val="none"/>
-              </w:rPr>
-              <w:t>2</w:t>
-            </w:r>
-          </w:p>
-        </w:tc>
-        <w:tc>
-          <w:tcPr>
-            <w:tcW w:w="367" w:type="pct"/>
-            <w:tcBorders>
-              <w:top w:val="single" w:sz="4" w:space="0" w:color="auto"/>
-              <w:left w:val="single" w:sz="4" w:space="0" w:color="auto"/>
-              <w:bottom w:val="single" w:sz="4" w:space="0" w:color="auto"/>
-              <w:right w:val="single" w:sz="4" w:space="0" w:color="auto"/>
-            </w:tcBorders>
-            <w:tcMar>
-              <w:top w:w="0" w:type="dxa"/>
-              <w:left w:w="45" w:type="dxa"/>
-              <w:bottom w:w="0" w:type="dxa"/>
-              <w:right w:w="45" w:type="dxa"/>
-            </w:tcMar>
-            <w:vAlign w:val="center"/>
-          </w:tcPr>
-          <w:p>
-            <w:pPr>
-              <w:spacing w:after="0" w:line="240" w:lineRule="auto"/>
-              <w:rPr>
-                <w:rFonts w:ascii="Times New Roman" w:eastAsia="Times New Roman" w:hAnsi="Times New Roman" w:cs="Times New Roman"/>
-                <w:kern w:val="0"/>
-                <w:sz w:val="26"/>
-                <w:szCs w:val="26"/>
-                <w14:ligatures w14:val="none"/>
-              </w:rPr>
-            </w:pPr>
-            <w:r>
-              <w:rPr>
-                <w:rFonts w:ascii="Times New Roman" w:eastAsia="Times New Roman" w:hAnsi="Times New Roman" w:cs="Times New Roman"/>
-                <w:kern w:val="0"/>
-                <w:sz w:val="26"/>
-                <w:szCs w:val="26"/>
-                <w14:ligatures w14:val="none"/>
-              </w:rPr>
-              <w:t>{project_name}</w:t>
-            </w:r>
-          </w:p>
-        </w:tc>
-        <w:tc>
-          <w:tcPr>
-            <w:tcW w:w="300" w:type="pct"/>
-            <w:tcBorders>
-              <w:top w:val="single" w:sz="4" w:space="0" w:color="auto"/>
-              <w:left w:val="single" w:sz="4" w:space="0" w:color="auto"/>
-              <w:bottom w:val="single" w:sz="4" w:space="0" w:color="auto"/>
-              <w:right w:val="single" w:sz="4" w:space="0" w:color="auto"/>
-            </w:tcBorders>
-            <w:tcMar>
-              <w:top w:w="0" w:type="dxa"/>
-              <w:left w:w="45" w:type="dxa"/>
-              <w:bottom w:w="0" w:type="dxa"/>
-              <w:right w:w="45" w:type="dxa"/>
-            </w:tcMar>
-            <w:vAlign w:val="center"/>
-          </w:tcPr>
-          <w:p>
-            <w:pPr>
-              <w:spacing w:after="0" w:line="240" w:lineRule="auto"/>
-              <w:jc w:val="center"/>
-              <w:rPr>
-                <w:rFonts w:ascii="Times New Roman" w:eastAsia="Times New Roman" w:hAnsi="Times New Roman" w:cs="Times New Roman"/>
-                <w:color w:val="001A33"/>
-                <w:kern w:val="0"/>
-                <w:sz w:val="26"/>
-                <w:szCs w:val="26"/>
-                <w14:ligatures w14:val="none"/>
-              </w:rPr>
-            </w:pPr>
-            <w:r>
-              <w:rPr>
-                <w:rFonts w:ascii="Times New Roman" w:eastAsia="Times New Roman" w:hAnsi="Times New Roman" w:cs="Times New Roman"/>
-                <w:color w:val="001A33"/>
-                <w:kern w:val="0"/>
-                <w:sz w:val="26"/>
-                <w:szCs w:val="26"/>
-                <w14:ligatures w14:val="none"/>
-              </w:rPr>
-              <w:t>{student_id}</w:t>
-            </w:r>
-          </w:p>
-        </w:tc>
-        <w:tc>
-          <w:tcPr>
-            <w:tcW w:w="473" w:type="pct"/>
-            <w:tcBorders>
-              <w:top w:val="single" w:sz="4" w:space="0" w:color="auto"/>
-              <w:left w:val="single" w:sz="4" w:space="0" w:color="auto"/>
-              <w:bottom w:val="single" w:sz="4" w:space="0" w:color="auto"/>
-              <w:right w:val="single" w:sz="4" w:space="0" w:color="auto"/>
-            </w:tcBorders>
-            <w:tcMar>
-              <w:top w:w="0" w:type="dxa"/>
-              <w:left w:w="45" w:type="dxa"/>
-              <w:bottom w:w="0" w:type="dxa"/>
-              <w:right w:w="45" w:type="dxa"/>
-            </w:tcMar>
-            <w:vAlign w:val="center"/>
-          </w:tcPr>
-          <w:p>
-            <w:pPr>
-              <w:spacing w:after="0" w:line="240" w:lineRule="auto"/>
-              <w:rPr>
-                <w:rFonts w:ascii="Times New Roman" w:eastAsia="Times New Roman" w:hAnsi="Times New Roman" w:cs="Times New Roman"/>
-                <w:kern w:val="0"/>
-                <w:sz w:val="26"/>
-                <w:szCs w:val="26"/>
-                <w14:ligatures w14:val="none"/>
-              </w:rPr>
-            </w:pPr>
-            <w:r>
-              <w:rPr>
-                <w:rFonts w:ascii="Times New Roman" w:eastAsia="Times New Roman" w:hAnsi="Times New Roman" w:cs="Times New Roman"/>
-                <w:kern w:val="0"/>
-                <w:sz w:val="26"/>
-                <w:szCs w:val="26"/>
-                <w14:ligatures w14:val="none"/>
-              </w:rPr>
-              <w:t>{student_last_name}</w:t>
-            </w:r>
-          </w:p>
-        </w:tc>
-        <w:tc>
-          <w:tcPr>
-            <w:tcW w:w="485" w:type="pct"/>
-            <w:tcBorders>
-              <w:top w:val="single" w:sz="4" w:space="0" w:color="auto"/>
-              <w:left w:val="single" w:sz="4" w:space="0" w:color="auto"/>
-              <w:bottom w:val="single" w:sz="4" w:space="0" w:color="auto"/>
-              <w:right w:val="single" w:sz="4" w:space="0" w:color="auto"/>
-            </w:tcBorders>
-            <w:tcMar>
-              <w:top w:w="0" w:type="dxa"/>
-              <w:left w:w="45" w:type="dxa"/>
-              <w:bottom w:w="0" w:type="dxa"/>
-              <w:right w:w="45" w:type="dxa"/>
-            </w:tcMar>
-            <w:vAlign w:val="center"/>
-          </w:tcPr>
-          <w:p>
-            <w:pPr>
-              <w:spacing w:after="0" w:line="240" w:lineRule="auto"/>
-              <w:rPr>
-                <w:rFonts w:ascii="Times New Roman" w:eastAsia="Times New Roman" w:hAnsi="Times New Roman" w:cs="Times New Roman"/>
-                <w:kern w:val="0"/>
-                <w:sz w:val="26"/>
-                <w:szCs w:val="26"/>
-                <w14:ligatures w14:val="none"/>
-              </w:rPr>
-            </w:pPr>
-            <w:r>
-              <w:rPr>
-                <w:rFonts w:ascii="Times New Roman" w:eastAsia="Times New Roman" w:hAnsi="Times New Roman" w:cs="Times New Roman"/>
-                <w:kern w:val="0"/>
-                <w:sz w:val="26"/>
-                <w:szCs w:val="26"/>
-                <w14:ligatures w14:val="none"/>
-              </w:rPr>
-              <w:t>{student_first_name}</w:t>
-            </w:r>
-          </w:p>
-        </w:tc>
-        <w:tc>
-          <w:tcPr>
-            <w:tcW w:w="419" w:type="pct"/>
-            <w:tcBorders>
-              <w:top w:val="single" w:sz="4" w:space="0" w:color="auto"/>
-              <w:left w:val="single" w:sz="4" w:space="0" w:color="auto"/>
-              <w:bottom w:val="single" w:sz="4" w:space="0" w:color="auto"/>
-              <w:right w:val="single" w:sz="4" w:space="0" w:color="auto"/>
-            </w:tcBorders>
-            <w:tcMar>
-              <w:top w:w="0" w:type="dxa"/>
-              <w:left w:w="45" w:type="dxa"/>
-              <w:bottom w:w="0" w:type="dxa"/>
-              <w:right w:w="45" w:type="dxa"/>
-            </w:tcMar>
-            <w:vAlign w:val="center"/>
-          </w:tcPr>
-          <w:p>
-            <w:pPr>
-              <w:spacing w:after="0" w:line="240" w:lineRule="auto"/>
-              <w:jc w:val="center"/>
-              <w:rPr>
-                <w:rFonts w:ascii="Times New Roman" w:eastAsia="Times New Roman" w:hAnsi="Times New Roman" w:cs="Times New Roman"/>
-                <w:kern w:val="0"/>
-                <w:sz w:val="28"/>
-                <w:szCs w:val="28"/>
-                <w14:ligatures w14:val="none"/>
-              </w:rPr>
-            </w:pPr>
-            <w:r>
-              <w:rPr>
-                <w:rFonts w:ascii="Times New Roman" w:eastAsia="Times New Roman" w:hAnsi="Times New Roman" w:cs="Times New Roman"/>
-                <w:kern w:val="0"/>
-                <w:sz w:val="28"/>
-                <w:szCs w:val="28"/>
-                <w14:ligatures w14:val="none"/>
-              </w:rPr>
-              <w:t>{gvhd_score}/10</w:t>
-            </w:r>
-          </w:p>
-        </w:tc>
-        <w:tc>
-          <w:tcPr>
-            <w:tcW w:w="392" w:type="pct"/>
-            <w:tcBorders>
-              <w:top w:val="single" w:sz="4" w:space="0" w:color="auto"/>
-              <w:left w:val="single" w:sz="4" w:space="0" w:color="auto"/>
-              <w:bottom w:val="single" w:sz="4" w:space="0" w:color="auto"/>
-              <w:right w:val="single" w:sz="4" w:space="0" w:color="auto"/>
-            </w:tcBorders>
-            <w:vAlign w:val="center"/>
-          </w:tcPr>
-          <w:p>
-            <w:pPr>
-              <w:spacing w:after="0" w:line="240" w:lineRule="auto"/>
-              <w:jc w:val="center"/>
-              <w:rPr>
-                <w:rFonts w:ascii="Times New Roman" w:eastAsia="Times New Roman" w:hAnsi="Times New Roman" w:cs="Times New Roman"/>
-                <w:kern w:val="0"/>
-                <w:sz w:val="28"/>
-                <w:szCs w:val="28"/>
-                <w14:ligatures w14:val="none"/>
-              </w:rPr>
-            </w:pPr>
-            <w:r>
-              <w:rPr>
-                <w:rFonts w:ascii="Times New Roman" w:eastAsia="Times New Roman" w:hAnsi="Times New Roman" w:cs="Times New Roman"/>
-                <w:kern w:val="0"/>
-                <w:sz w:val="28"/>
-                <w:szCs w:val="28"/>
-                <w14:ligatures w14:val="none"/>
-              </w:rPr>
-              <w:t>{gvpb_score}/10</w:t>
-            </w:r>
-          </w:p>
-        </w:tc>
-        <w:tc>
-          <w:tcPr>
-            <w:tcW w:w="602" w:type="pct"/>
-            <w:tcBorders>
-              <w:top w:val="single" w:sz="4" w:space="0" w:color="auto"/>
-              <w:left w:val="single" w:sz="4" w:space="0" w:color="auto"/>
-              <w:bottom w:val="single" w:sz="4" w:space="0" w:color="auto"/>
-              <w:right w:val="single" w:sz="4" w:space="0" w:color="auto"/>
-            </w:tcBorders>
-            <w:tcMar>
-              <w:top w:w="0" w:type="dxa"/>
-              <w:left w:w="45" w:type="dxa"/>
-              <w:bottom w:w="0" w:type="dxa"/>
-              <w:right w:w="45" w:type="dxa"/>
-            </w:tcMar>
-            <w:vAlign w:val="center"/>
-          </w:tcPr>
-          <w:p>
-            <w:pPr>
-              <w:spacing w:after="0" w:line="240" w:lineRule="auto"/>
-              <w:jc w:val="center"/>
-              <w:rPr>
-                <w:rFonts w:ascii="Times New Roman" w:eastAsia="Times New Roman" w:hAnsi="Times New Roman" w:cs="Times New Roman"/>
-                <w:kern w:val="0"/>
-                <w:sz w:val="28"/>
-                <w:szCs w:val="28"/>
-                <w14:ligatures w14:val="none"/>
-              </w:rPr>
-            </w:pPr>
-            <w:r>
-              <w:rPr>
-                <w:rFonts w:ascii="Times New Roman" w:eastAsia="Times New Roman" w:hAnsi="Times New Roman" w:cs="Times New Roman"/>
-                <w:kern w:val="0"/>
-                <w:sz w:val="28"/>
-                <w:szCs w:val="28"/>
-                <w14:ligatures w14:val="none"/>
-              </w:rPr>
-              <w:t>{committee_1_score}/10</w:t>
-            </w:r>
-          </w:p>
-        </w:tc>
-        <w:tc>
-          <w:tcPr>
-            <w:tcW w:w="602" w:type="pct"/>
-            <w:tcBorders>
-              <w:top w:val="single" w:sz="4" w:space="0" w:color="auto"/>
-              <w:left w:val="single" w:sz="4" w:space="0" w:color="auto"/>
-              <w:bottom w:val="single" w:sz="4" w:space="0" w:color="auto"/>
-              <w:right w:val="single" w:sz="4" w:space="0" w:color="auto"/>
-            </w:tcBorders>
-            <w:tcMar>
-              <w:top w:w="0" w:type="dxa"/>
-              <w:left w:w="45" w:type="dxa"/>
-              <w:bottom w:w="0" w:type="dxa"/>
-              <w:right w:w="45" w:type="dxa"/>
-            </w:tcMar>
-            <w:vAlign w:val="center"/>
-          </w:tcPr>
-          <w:p>
-            <w:pPr>
-              <w:spacing w:after="0" w:line="240" w:lineRule="auto"/>
-              <w:jc w:val="center"/>
-              <w:rPr>
-                <w:rFonts w:ascii="Times New Roman" w:eastAsia="Times New Roman" w:hAnsi="Times New Roman" w:cs="Times New Roman"/>
-                <w:kern w:val="0"/>
-                <w:sz w:val="28"/>
-                <w:szCs w:val="28"/>
-                <w14:ligatures w14:val="none"/>
-              </w:rPr>
-            </w:pPr>
-            <w:r>
-              <w:rPr>
-                <w:rFonts w:ascii="Times New Roman" w:eastAsia="Times New Roman" w:hAnsi="Times New Roman" w:cs="Times New Roman"/>
-                <w:kern w:val="0"/>
-                <w:sz w:val="28"/>
-                <w:szCs w:val="28"/>
-                <w14:ligatures w14:val="none"/>
-              </w:rPr>
-              <w:t>{committee_2_score}/10</w:t>
-            </w:r>
-          </w:p>
-        </w:tc>
-        <w:tc>
-          <w:tcPr>
-            <w:tcW w:w="602" w:type="pct"/>
-            <w:tcBorders>
-              <w:top w:val="single" w:sz="4" w:space="0" w:color="auto"/>
-              <w:left w:val="single" w:sz="4" w:space="0" w:color="auto"/>
-              <w:bottom w:val="single" w:sz="4" w:space="0" w:color="auto"/>
-              <w:right w:val="single" w:sz="4" w:space="0" w:color="auto"/>
-            </w:tcBorders>
-            <w:tcMar>
-              <w:top w:w="0" w:type="dxa"/>
-              <w:left w:w="45" w:type="dxa"/>
-              <w:bottom w:w="0" w:type="dxa"/>
-              <w:right w:w="45" w:type="dxa"/>
-            </w:tcMar>
-            <w:vAlign w:val="center"/>
-          </w:tcPr>
-          <w:p>
-            <w:pPr>
-              <w:spacing w:after="0" w:line="240" w:lineRule="auto"/>
-              <w:jc w:val="center"/>
-              <w:rPr>
-                <w:rFonts w:ascii="Times New Roman" w:eastAsia="Times New Roman" w:hAnsi="Times New Roman" w:cs="Times New Roman"/>
-                <w:kern w:val="0"/>
-                <w:sz w:val="28"/>
-                <w:szCs w:val="28"/>
-                <w14:ligatures w14:val="none"/>
-              </w:rPr>
-            </w:pPr>
-            <w:r>
-              <w:rPr>
-                <w:rFonts w:ascii="Times New Roman" w:eastAsia="Times New Roman" w:hAnsi="Times New Roman" w:cs="Times New Roman"/>
-                <w:kern w:val="0"/>
-                <w:sz w:val="28"/>
-                <w:szCs w:val="28"/>
-                <w14:ligatures w14:val="none"/>
-              </w:rPr>
-              <w:t>{committee_3_score}</w:t>
-            </w:r>
-            <w:r>
-              <w:rPr>
-                <w:rFonts w:ascii="Times New Roman" w:eastAsia="Times New Roman" w:hAnsi="Times New Roman" w:cs="Times New Roman"/>
-                <w:kern w:val="0"/>
-                <w:sz w:val="28"/>
-                <w:szCs w:val="28"/>
-                <w14:ligatures w14:val="none"/>
-              </w:rPr>
-              <w:t>/10</w:t>
-            </w:r>
-          </w:p>
-        </w:tc>
-        <w:tc>
-          <w:tcPr>
-            <w:tcW w:w="479" w:type="pct"/>
-            <w:tcBorders>
-              <w:top w:val="single" w:sz="4" w:space="0" w:color="auto"/>
-              <w:left w:val="single" w:sz="4" w:space="0" w:color="auto"/>
-              <w:bottom w:val="single" w:sz="4" w:space="0" w:color="auto"/>
-              <w:right w:val="single" w:sz="4" w:space="0" w:color="auto"/>
-            </w:tcBorders>
-            <w:tcMar>
-              <w:top w:w="0" w:type="dxa"/>
-              <w:left w:w="45" w:type="dxa"/>
-              <w:bottom w:w="0" w:type="dxa"/>
-              <w:right w:w="45" w:type="dxa"/>
-            </w:tcMar>
-            <w:vAlign w:val="center"/>
-          </w:tcPr>
-          <w:p>
-            <w:pPr>
-              <w:spacing w:after="0" w:line="240" w:lineRule="auto"/>
-              <w:jc w:val="center"/>
-              <w:rPr>
-                <w:rFonts w:ascii="Times New Roman" w:eastAsia="Times New Roman" w:hAnsi="Times New Roman" w:cs="Times New Roman"/>
-                <w:b/>
-                <w:bCs/>
-                <w:kern w:val="0"/>
-                <w:sz w:val="26"/>
-                <w:szCs w:val="26"/>
-                <w14:ligatures w14:val="none"/>
-              </w:rPr>
-            </w:pPr>
-            <w:r>
-              <w:rPr>
-                <w:rFonts w:ascii="Times New Roman" w:eastAsia="Times New Roman" w:hAnsi="Times New Roman" w:cs="Times New Roman"/>
-                <w:kern w:val="0"/>
-                <w:sz w:val="28"/>
-                <w:szCs w:val="28"/>
-                <w14:ligatures w14:val="none"/>
-              </w:rPr>
-              <w:t>{final_score}</w:t>
-            </w:r>
-            <w:r>
-              <w:rPr>
-                <w:rFonts w:ascii="Times New Roman" w:eastAsia="Times New Roman" w:hAnsi="Times New Roman" w:cs="Times New Roman"/>
-                <w:kern w:val="0"/>
-                <w:sz w:val="28"/>
-                <w:szCs w:val="28"/>
-                <w14:ligatures w14:val="none"/>
-              </w:rPr>
-              <w:t>/10</w:t>
-            </w:r>
-          </w:p>
-        </w:tc>
-        <w:tc>
-          <w:tcPr>
-            <w:tcW w:w="151" w:type="pct"/>
-            <w:tcBorders>
-              <w:top w:val="single" w:sz="4" w:space="0" w:color="auto"/>
-              <w:left w:val="single" w:sz="4" w:space="0" w:color="auto"/>
-              <w:bottom w:val="single" w:sz="4" w:space="0" w:color="auto"/>
-              <w:right w:val="single" w:sz="4" w:space="0" w:color="auto"/>
-            </w:tcBorders>
-            <w:tcMar>
-              <w:top w:w="0" w:type="dxa"/>
-              <w:left w:w="45" w:type="dxa"/>
-              <w:bottom w:w="0" w:type="dxa"/>
-              <w:right w:w="45" w:type="dxa"/>
-            </w:tcMar>
-            <w:vAlign w:val="center"/>
-          </w:tcPr>
-          <w:p>
-            <w:pPr>
-              <w:spacing w:after="0" w:line="240" w:lineRule="auto"/>
-              <w:jc w:val="center"/>
-              <w:rPr>
-                <w:rFonts w:ascii="Times New Roman" w:eastAsia="Times New Roman" w:hAnsi="Times New Roman" w:cs="Times New Roman"/>
-                <w:kern w:val="0"/>
-                <w:sz w:val="26"/>
-                <w:szCs w:val="26"/>
-                <w14:ligatures w14:val="none"/>
-              </w:rPr>
-            </w:pPr>
-            <w:r>
-              <w:rPr>
-                <w:rFonts w:ascii="Times New Roman" w:eastAsia="Times New Roman" w:hAnsi="Times New Roman" w:cs="Times New Roman"/>
-                <w:kern w:val="0"/>
-                <w:sz w:val="26"/>
-                <w:szCs w:val="26"/>
-                <w14:ligatures w14:val="none"/>
-              </w:rPr>
-              <w:t>{final_score_text}</w:t>
-            </w:r>
-          </w:p>
-        </w:tc>
-      </w:tr>
-      <w:tr>
-        <w:trPr>
-          <w:trHeight w:val="795"/>
-        </w:trPr>
-        <w:tc>
-          <w:tcPr>
-            <w:tcW w:w="130" w:type="pct"/>
-            <w:tcBorders>
-              <w:top w:val="single" w:sz="4" w:space="0" w:color="auto"/>
-              <w:left w:val="single" w:sz="4" w:space="0" w:color="auto"/>
-              <w:bottom w:val="single" w:sz="4" w:space="0" w:color="auto"/>
-              <w:right w:val="single" w:sz="4" w:space="0" w:color="auto"/>
-            </w:tcBorders>
-            <w:tcMar>
-              <w:top w:w="0" w:type="dxa"/>
-              <w:left w:w="45" w:type="dxa"/>
-              <w:bottom w:w="0" w:type="dxa"/>
-              <w:right w:w="45" w:type="dxa"/>
-            </w:tcMar>
-            <w:vAlign w:val="center"/>
-          </w:tcPr>
-          <w:p>
-            <w:pPr>
-              <w:spacing w:after="0" w:line="240" w:lineRule="auto"/>
-              <w:jc w:val="center"/>
-              <w:rPr>
-                <w:rFonts w:ascii="Times New Roman" w:eastAsia="Times New Roman" w:hAnsi="Times New Roman" w:cs="Times New Roman"/>
-                <w:kern w:val="0"/>
-                <w:sz w:val="24"/>
-                <w:szCs w:val="24"/>
-                <w14:ligatures w14:val="none"/>
-              </w:rPr>
-            </w:pPr>
-            <w:r>
-              <w:rPr>
-                <w:rFonts w:ascii="Times New Roman" w:eastAsia="Times New Roman" w:hAnsi="Times New Roman" w:cs="Times New Roman"/>
-                <w:kern w:val="0"/>
-                <w:sz w:val="24"/>
-                <w:szCs w:val="24"/>
-                <w14:ligatures w14:val="none"/>
-              </w:rPr>
-              <w:t>3</w:t>
-            </w:r>
-          </w:p>
-        </w:tc>
-        <w:tc>
-          <w:tcPr>
-            <w:tcW w:w="367" w:type="pct"/>
-            <w:tcBorders>
-              <w:top w:val="single" w:sz="4" w:space="0" w:color="auto"/>
-              <w:left w:val="single" w:sz="4" w:space="0" w:color="auto"/>
-              <w:bottom w:val="single" w:sz="4" w:space="0" w:color="auto"/>
-              <w:right w:val="single" w:sz="4" w:space="0" w:color="auto"/>
-            </w:tcBorders>
-            <w:tcMar>
-              <w:top w:w="0" w:type="dxa"/>
-              <w:left w:w="45" w:type="dxa"/>
-              <w:bottom w:w="0" w:type="dxa"/>
-              <w:right w:w="45" w:type="dxa"/>
-            </w:tcMar>
-            <w:vAlign w:val="center"/>
-          </w:tcPr>
-          <w:p>
-            <w:pPr>
-              <w:spacing w:after="0" w:line="240" w:lineRule="auto"/>
-              <w:rPr>
-                <w:rFonts w:ascii="Times New Roman" w:eastAsia="Times New Roman" w:hAnsi="Times New Roman" w:cs="Times New Roman"/>
-                <w:kern w:val="0"/>
-                <w:sz w:val="26"/>
-                <w:szCs w:val="26"/>
-                <w14:ligatures w14:val="none"/>
-              </w:rPr>
-            </w:pPr>
-            <w:r>
-              <w:rPr>
-                <w:rFonts w:ascii="Times New Roman" w:eastAsia="Times New Roman" w:hAnsi="Times New Roman" w:cs="Times New Roman"/>
-                <w:kern w:val="0"/>
-                <w:sz w:val="26"/>
-                <w:szCs w:val="26"/>
-                <w14:ligatures w14:val="none"/>
-              </w:rPr>
-              <w:t>{project_name}</w:t>
-            </w:r>
-          </w:p>
-        </w:tc>
-        <w:tc>
-          <w:tcPr>
-            <w:tcW w:w="300" w:type="pct"/>
-            <w:tcBorders>
-              <w:top w:val="single" w:sz="4" w:space="0" w:color="auto"/>
-              <w:left w:val="single" w:sz="4" w:space="0" w:color="auto"/>
-              <w:bottom w:val="single" w:sz="4" w:space="0" w:color="auto"/>
-              <w:right w:val="single" w:sz="4" w:space="0" w:color="auto"/>
-            </w:tcBorders>
-            <w:tcMar>
-              <w:top w:w="0" w:type="dxa"/>
-              <w:left w:w="45" w:type="dxa"/>
-              <w:bottom w:w="0" w:type="dxa"/>
-              <w:right w:w="45" w:type="dxa"/>
-            </w:tcMar>
-            <w:vAlign w:val="center"/>
-          </w:tcPr>
-          <w:p>
-            <w:pPr>
-              <w:spacing w:after="0" w:line="240" w:lineRule="auto"/>
-              <w:jc w:val="center"/>
-              <w:rPr>
-                <w:rFonts w:ascii="Times New Roman" w:eastAsia="Times New Roman" w:hAnsi="Times New Roman" w:cs="Times New Roman"/>
-                <w:color w:val="001A33"/>
-                <w:kern w:val="0"/>
-                <w:sz w:val="26"/>
-                <w:szCs w:val="26"/>
-                <w14:ligatures w14:val="none"/>
-              </w:rPr>
-            </w:pPr>
-            <w:r>
-              <w:rPr>
-                <w:rFonts w:ascii="Times New Roman" w:eastAsia="Times New Roman" w:hAnsi="Times New Roman" w:cs="Times New Roman"/>
-                <w:color w:val="001A33"/>
-                <w:kern w:val="0"/>
-                <w:sz w:val="26"/>
-                <w:szCs w:val="26"/>
-                <w14:ligatures w14:val="none"/>
-              </w:rPr>
-              <w:t>{student_id}</w:t>
-            </w:r>
-          </w:p>
-        </w:tc>
-        <w:tc>
-          <w:tcPr>
-            <w:tcW w:w="473" w:type="pct"/>
-            <w:tcBorders>
-              <w:top w:val="single" w:sz="4" w:space="0" w:color="auto"/>
-              <w:left w:val="single" w:sz="4" w:space="0" w:color="auto"/>
-              <w:bottom w:val="single" w:sz="4" w:space="0" w:color="auto"/>
-              <w:right w:val="single" w:sz="4" w:space="0" w:color="auto"/>
-            </w:tcBorders>
-            <w:tcMar>
-              <w:top w:w="0" w:type="dxa"/>
-              <w:left w:w="45" w:type="dxa"/>
-              <w:bottom w:w="0" w:type="dxa"/>
-              <w:right w:w="45" w:type="dxa"/>
-            </w:tcMar>
-            <w:vAlign w:val="center"/>
-          </w:tcPr>
-          <w:p>
-            <w:pPr>
-              <w:spacing w:after="0" w:line="240" w:lineRule="auto"/>
-              <w:rPr>
-                <w:rFonts w:ascii="Times New Roman" w:eastAsia="Times New Roman" w:hAnsi="Times New Roman" w:cs="Times New Roman"/>
-                <w:kern w:val="0"/>
-                <w:sz w:val="26"/>
-                <w:szCs w:val="26"/>
-                <w14:ligatures w14:val="none"/>
-              </w:rPr>
-            </w:pPr>
-            <w:r>
-              <w:rPr>
-                <w:rFonts w:ascii="Times New Roman" w:eastAsia="Times New Roman" w:hAnsi="Times New Roman" w:cs="Times New Roman"/>
-                <w:kern w:val="0"/>
-                <w:sz w:val="26"/>
-                <w:szCs w:val="26"/>
-                <w14:ligatures w14:val="none"/>
-              </w:rPr>
-              <w:t>{student_last_name}</w:t>
-            </w:r>
-          </w:p>
-        </w:tc>
-        <w:tc>
-          <w:tcPr>
-            <w:tcW w:w="485" w:type="pct"/>
-            <w:tcBorders>
-              <w:top w:val="single" w:sz="4" w:space="0" w:color="auto"/>
-              <w:left w:val="single" w:sz="4" w:space="0" w:color="auto"/>
-              <w:bottom w:val="single" w:sz="4" w:space="0" w:color="auto"/>
-              <w:right w:val="single" w:sz="4" w:space="0" w:color="auto"/>
-            </w:tcBorders>
-            <w:tcMar>
-              <w:top w:w="0" w:type="dxa"/>
-              <w:left w:w="45" w:type="dxa"/>
-              <w:bottom w:w="0" w:type="dxa"/>
-              <w:right w:w="45" w:type="dxa"/>
-            </w:tcMar>
-            <w:vAlign w:val="center"/>
-          </w:tcPr>
-          <w:p>
-            <w:pPr>
-              <w:spacing w:after="0" w:line="240" w:lineRule="auto"/>
-              <w:rPr>
-                <w:rFonts w:ascii="Times New Roman" w:eastAsia="Times New Roman" w:hAnsi="Times New Roman" w:cs="Times New Roman"/>
-                <w:kern w:val="0"/>
-                <w:sz w:val="26"/>
-                <w:szCs w:val="26"/>
-                <w14:ligatures w14:val="none"/>
-              </w:rPr>
-            </w:pPr>
-            <w:r>
-              <w:rPr>
-                <w:rFonts w:ascii="Times New Roman" w:eastAsia="Times New Roman" w:hAnsi="Times New Roman" w:cs="Times New Roman"/>
-                <w:kern w:val="0"/>
-                <w:sz w:val="26"/>
-                <w:szCs w:val="26"/>
-                <w14:ligatures w14:val="none"/>
-              </w:rPr>
-              <w:t>{student_first_name}</w:t>
-            </w:r>
-          </w:p>
-        </w:tc>
-        <w:tc>
-          <w:tcPr>
-            <w:tcW w:w="419" w:type="pct"/>
-            <w:tcBorders>
-              <w:top w:val="single" w:sz="4" w:space="0" w:color="auto"/>
-              <w:left w:val="single" w:sz="4" w:space="0" w:color="auto"/>
-              <w:bottom w:val="single" w:sz="4" w:space="0" w:color="auto"/>
-              <w:right w:val="single" w:sz="4" w:space="0" w:color="auto"/>
-            </w:tcBorders>
-            <w:tcMar>
-              <w:top w:w="0" w:type="dxa"/>
-              <w:left w:w="45" w:type="dxa"/>
-              <w:bottom w:w="0" w:type="dxa"/>
-              <w:right w:w="45" w:type="dxa"/>
-            </w:tcMar>
-            <w:vAlign w:val="center"/>
-          </w:tcPr>
-          <w:p>
-            <w:pPr>
-              <w:spacing w:after="0" w:line="240" w:lineRule="auto"/>
-              <w:jc w:val="center"/>
-              <w:rPr>
-                <w:rFonts w:ascii="Times New Roman" w:eastAsia="Times New Roman" w:hAnsi="Times New Roman" w:cs="Times New Roman"/>
-                <w:kern w:val="0"/>
-                <w:sz w:val="28"/>
-                <w:szCs w:val="28"/>
-                <w14:ligatures w14:val="none"/>
-              </w:rPr>
-            </w:pPr>
-            <w:r>
-              <w:rPr>
-                <w:rFonts w:ascii="Times New Roman" w:eastAsia="Times New Roman" w:hAnsi="Times New Roman" w:cs="Times New Roman"/>
-                <w:kern w:val="0"/>
-                <w:sz w:val="28"/>
-                <w:szCs w:val="28"/>
-                <w14:ligatures w14:val="none"/>
-              </w:rPr>
-              <w:t>{gvhd_score}/10</w:t>
-            </w:r>
-          </w:p>
-        </w:tc>
-        <w:tc>
-          <w:tcPr>
-            <w:tcW w:w="392" w:type="pct"/>
-            <w:tcBorders>
-              <w:top w:val="single" w:sz="4" w:space="0" w:color="auto"/>
-              <w:left w:val="single" w:sz="4" w:space="0" w:color="auto"/>
-              <w:bottom w:val="single" w:sz="4" w:space="0" w:color="auto"/>
-              <w:right w:val="single" w:sz="4" w:space="0" w:color="auto"/>
-            </w:tcBorders>
-            <w:vAlign w:val="center"/>
-          </w:tcPr>
-          <w:p>
-            <w:pPr>
-              <w:spacing w:after="0" w:line="240" w:lineRule="auto"/>
-              <w:jc w:val="center"/>
-              <w:rPr>
-                <w:rFonts w:ascii="Times New Roman" w:eastAsia="Times New Roman" w:hAnsi="Times New Roman" w:cs="Times New Roman"/>
-                <w:kern w:val="0"/>
-                <w:sz w:val="28"/>
-                <w:szCs w:val="28"/>
-                <w14:ligatures w14:val="none"/>
-              </w:rPr>
-            </w:pPr>
-            <w:r>
-              <w:rPr>
-                <w:rFonts w:ascii="Times New Roman" w:eastAsia="Times New Roman" w:hAnsi="Times New Roman" w:cs="Times New Roman"/>
-                <w:kern w:val="0"/>
-                <w:sz w:val="28"/>
-                <w:szCs w:val="28"/>
-                <w14:ligatures w14:val="none"/>
-              </w:rPr>
-              <w:t>{gvpb_score}/10</w:t>
-            </w:r>
-          </w:p>
-        </w:tc>
-        <w:tc>
-          <w:tcPr>
-            <w:tcW w:w="602" w:type="pct"/>
-            <w:tcBorders>
-              <w:top w:val="single" w:sz="4" w:space="0" w:color="auto"/>
-              <w:left w:val="single" w:sz="4" w:space="0" w:color="auto"/>
-              <w:bottom w:val="single" w:sz="4" w:space="0" w:color="auto"/>
-              <w:right w:val="single" w:sz="4" w:space="0" w:color="auto"/>
-            </w:tcBorders>
-            <w:tcMar>
-              <w:top w:w="0" w:type="dxa"/>
-              <w:left w:w="45" w:type="dxa"/>
-              <w:bottom w:w="0" w:type="dxa"/>
-              <w:right w:w="45" w:type="dxa"/>
-            </w:tcMar>
-            <w:vAlign w:val="center"/>
-          </w:tcPr>
-          <w:p>
-            <w:pPr>
-              <w:spacing w:after="0" w:line="240" w:lineRule="auto"/>
-              <w:jc w:val="center"/>
-              <w:rPr>
-                <w:rFonts w:ascii="Times New Roman" w:eastAsia="Times New Roman" w:hAnsi="Times New Roman" w:cs="Times New Roman"/>
-                <w:kern w:val="0"/>
-                <w:sz w:val="28"/>
-                <w:szCs w:val="28"/>
-                <w14:ligatures w14:val="none"/>
-              </w:rPr>
-            </w:pPr>
-            <w:r>
-              <w:rPr>
-                <w:rFonts w:ascii="Times New Roman" w:eastAsia="Times New Roman" w:hAnsi="Times New Roman" w:cs="Times New Roman"/>
-                <w:kern w:val="0"/>
-                <w:sz w:val="28"/>
-                <w:szCs w:val="28"/>
-                <w14:ligatures w14:val="none"/>
-              </w:rPr>
-              <w:t>{committee_1_score}/10</w:t>
-            </w:r>
-          </w:p>
-        </w:tc>
-        <w:tc>
-          <w:tcPr>
-            <w:tcW w:w="602" w:type="pct"/>
-            <w:tcBorders>
-              <w:top w:val="single" w:sz="4" w:space="0" w:color="auto"/>
-              <w:left w:val="single" w:sz="4" w:space="0" w:color="auto"/>
-              <w:bottom w:val="single" w:sz="4" w:space="0" w:color="auto"/>
-              <w:right w:val="single" w:sz="4" w:space="0" w:color="auto"/>
-            </w:tcBorders>
-            <w:tcMar>
-              <w:top w:w="0" w:type="dxa"/>
-              <w:left w:w="45" w:type="dxa"/>
-              <w:bottom w:w="0" w:type="dxa"/>
-              <w:right w:w="45" w:type="dxa"/>
-            </w:tcMar>
-            <w:vAlign w:val="center"/>
-          </w:tcPr>
-          <w:p>
-            <w:pPr>
-              <w:spacing w:after="0" w:line="240" w:lineRule="auto"/>
-              <w:jc w:val="center"/>
-              <w:rPr>
-                <w:rFonts w:ascii="Times New Roman" w:eastAsia="Times New Roman" w:hAnsi="Times New Roman" w:cs="Times New Roman"/>
-                <w:kern w:val="0"/>
-                <w:sz w:val="28"/>
-                <w:szCs w:val="28"/>
-                <w14:ligatures w14:val="none"/>
-              </w:rPr>
-            </w:pPr>
-            <w:r>
-              <w:rPr>
-                <w:rFonts w:ascii="Times New Roman" w:eastAsia="Times New Roman" w:hAnsi="Times New Roman" w:cs="Times New Roman"/>
-                <w:kern w:val="0"/>
-                <w:sz w:val="28"/>
-                <w:szCs w:val="28"/>
-                <w14:ligatures w14:val="none"/>
-              </w:rPr>
-              <w:t>{committee_2_score}/10</w:t>
-            </w:r>
-          </w:p>
-        </w:tc>
-        <w:tc>
-          <w:tcPr>
-            <w:tcW w:w="602" w:type="pct"/>
-            <w:tcBorders>
-              <w:top w:val="single" w:sz="4" w:space="0" w:color="auto"/>
-              <w:left w:val="single" w:sz="4" w:space="0" w:color="auto"/>
-              <w:bottom w:val="single" w:sz="4" w:space="0" w:color="auto"/>
-              <w:right w:val="single" w:sz="4" w:space="0" w:color="auto"/>
-            </w:tcBorders>
-            <w:tcMar>
-              <w:top w:w="0" w:type="dxa"/>
-              <w:left w:w="45" w:type="dxa"/>
-              <w:bottom w:w="0" w:type="dxa"/>
-              <w:right w:w="45" w:type="dxa"/>
-            </w:tcMar>
-            <w:vAlign w:val="center"/>
-          </w:tcPr>
-          <w:p>
-            <w:pPr>
-              <w:spacing w:after="0" w:line="240" w:lineRule="auto"/>
-              <w:jc w:val="center"/>
-              <w:rPr>
-                <w:rFonts w:ascii="Times New Roman" w:eastAsia="Times New Roman" w:hAnsi="Times New Roman" w:cs="Times New Roman"/>
-                <w:kern w:val="0"/>
-                <w:sz w:val="28"/>
-                <w:szCs w:val="28"/>
-                <w14:ligatures w14:val="none"/>
-              </w:rPr>
-            </w:pPr>
-            <w:r>
-              <w:rPr>
-                <w:rFonts w:ascii="Times New Roman" w:eastAsia="Times New Roman" w:hAnsi="Times New Roman" w:cs="Times New Roman"/>
-                <w:kern w:val="0"/>
-                <w:sz w:val="28"/>
-                <w:szCs w:val="28"/>
-                <w14:ligatures w14:val="none"/>
-              </w:rPr>
-              <w:t>{committee_3_score}</w:t>
-            </w:r>
-            <w:r>
-              <w:rPr>
-                <w:rFonts w:ascii="Times New Roman" w:eastAsia="Times New Roman" w:hAnsi="Times New Roman" w:cs="Times New Roman"/>
-                <w:kern w:val="0"/>
-                <w:sz w:val="28"/>
-                <w:szCs w:val="28"/>
-                <w14:ligatures w14:val="none"/>
-              </w:rPr>
-              <w:t>/10</w:t>
-            </w:r>
-          </w:p>
-        </w:tc>
-        <w:tc>
-          <w:tcPr>
-            <w:tcW w:w="479" w:type="pct"/>
-            <w:tcBorders>
-              <w:top w:val="single" w:sz="4" w:space="0" w:color="auto"/>
-              <w:left w:val="single" w:sz="4" w:space="0" w:color="auto"/>
-              <w:bottom w:val="single" w:sz="4" w:space="0" w:color="auto"/>
-              <w:right w:val="single" w:sz="4" w:space="0" w:color="auto"/>
-            </w:tcBorders>
-            <w:tcMar>
-              <w:top w:w="0" w:type="dxa"/>
-              <w:left w:w="45" w:type="dxa"/>
-              <w:bottom w:w="0" w:type="dxa"/>
-              <w:right w:w="45" w:type="dxa"/>
-            </w:tcMar>
-            <w:vAlign w:val="center"/>
-          </w:tcPr>
-          <w:p>
-            <w:pPr>
-              <w:spacing w:after="0" w:line="240" w:lineRule="auto"/>
-              <w:jc w:val="center"/>
-              <w:rPr>
-                <w:rFonts w:ascii="Times New Roman" w:eastAsia="Times New Roman" w:hAnsi="Times New Roman" w:cs="Times New Roman"/>
-                <w:b/>
-                <w:bCs/>
-                <w:kern w:val="0"/>
-                <w:sz w:val="26"/>
-                <w:szCs w:val="26"/>
-                <w14:ligatures w14:val="none"/>
-              </w:rPr>
-            </w:pPr>
-            <w:r>
-              <w:rPr>
-                <w:rFonts w:ascii="Times New Roman" w:eastAsia="Times New Roman" w:hAnsi="Times New Roman" w:cs="Times New Roman"/>
-                <w:kern w:val="0"/>
-                <w:sz w:val="28"/>
-                <w:szCs w:val="28"/>
-                <w14:ligatures w14:val="none"/>
-              </w:rPr>
-              <w:t>{final_score}</w:t>
-            </w:r>
-            <w:r>
-              <w:rPr>
-                <w:rFonts w:ascii="Times New Roman" w:eastAsia="Times New Roman" w:hAnsi="Times New Roman" w:cs="Times New Roman"/>
-                <w:kern w:val="0"/>
-                <w:sz w:val="28"/>
-                <w:szCs w:val="28"/>
-                <w14:ligatures w14:val="none"/>
-              </w:rPr>
-              <w:t>/10</w:t>
-            </w:r>
-          </w:p>
-        </w:tc>
-        <w:tc>
-          <w:tcPr>
-            <w:tcW w:w="151" w:type="pct"/>
-            <w:tcBorders>
-              <w:top w:val="single" w:sz="4" w:space="0" w:color="auto"/>
-              <w:left w:val="single" w:sz="4" w:space="0" w:color="auto"/>
-              <w:bottom w:val="single" w:sz="4" w:space="0" w:color="auto"/>
-              <w:right w:val="single" w:sz="4" w:space="0" w:color="auto"/>
-            </w:tcBorders>
-            <w:tcMar>
-              <w:top w:w="0" w:type="dxa"/>
-              <w:left w:w="45" w:type="dxa"/>
-              <w:bottom w:w="0" w:type="dxa"/>
-              <w:right w:w="45" w:type="dxa"/>
-            </w:tcMar>
-            <w:vAlign w:val="center"/>
-          </w:tcPr>
-          <w:p>
-            <w:pPr>
-              <w:spacing w:after="0" w:line="240" w:lineRule="auto"/>
-              <w:jc w:val="center"/>
-              <w:rPr>
-                <w:rFonts w:ascii="Times New Roman" w:eastAsia="Times New Roman" w:hAnsi="Times New Roman" w:cs="Times New Roman"/>
-                <w:kern w:val="0"/>
-                <w:sz w:val="26"/>
-                <w:szCs w:val="26"/>
-                <w14:ligatures w14:val="none"/>
-              </w:rPr>
-            </w:pPr>
-            <w:r>
-              <w:rPr>
-                <w:rFonts w:ascii="Times New Roman" w:eastAsia="Times New Roman" w:hAnsi="Times New Roman" w:cs="Times New Roman"/>
-                <w:kern w:val="0"/>
-                <w:sz w:val="26"/>
-                <w:szCs w:val="26"/>
-                <w14:ligatures w14:val="none"/>
-              </w:rPr>
-              <w:t>{final_score_text}</w:t>
-            </w:r>
-          </w:p>
-        </w:tc>
-      </w:tr>
-      <w:tr>
-        <w:trPr>
-          <w:trHeight w:val="795"/>
-        </w:trPr>
-        <w:tc>
-          <w:tcPr>
-            <w:tcW w:w="130" w:type="pct"/>
-            <w:tcBorders>
-              <w:top w:val="single" w:sz="4" w:space="0" w:color="auto"/>
-              <w:left w:val="single" w:sz="4" w:space="0" w:color="auto"/>
-              <w:bottom w:val="single" w:sz="4" w:space="0" w:color="auto"/>
-              <w:right w:val="single" w:sz="4" w:space="0" w:color="auto"/>
-            </w:tcBorders>
-            <w:tcMar>
-              <w:top w:w="0" w:type="dxa"/>
-              <w:left w:w="45" w:type="dxa"/>
-              <w:bottom w:w="0" w:type="dxa"/>
-              <w:right w:w="45" w:type="dxa"/>
-            </w:tcMar>
-            <w:vAlign w:val="center"/>
-          </w:tcPr>
-          <w:p>
-            <w:pPr>
-              <w:spacing w:after="0" w:line="240" w:lineRule="auto"/>
-              <w:jc w:val="center"/>
-              <w:rPr>
-                <w:rFonts w:ascii="Times New Roman" w:eastAsia="Times New Roman" w:hAnsi="Times New Roman" w:cs="Times New Roman"/>
-                <w:kern w:val="0"/>
-                <w:sz w:val="24"/>
-                <w:szCs w:val="24"/>
-                <w14:ligatures w14:val="none"/>
-              </w:rPr>
-            </w:pPr>
-            <w:r>
-              <w:rPr>
-                <w:rFonts w:ascii="Times New Roman" w:eastAsia="Times New Roman" w:hAnsi="Times New Roman" w:cs="Times New Roman"/>
-                <w:kern w:val="0"/>
-                <w:sz w:val="24"/>
-                <w:szCs w:val="24"/>
-                <w14:ligatures w14:val="none"/>
-              </w:rPr>
-              <w:t>…</w:t>
-            </w:r>
-          </w:p>
-        </w:tc>
-        <w:tc>
-          <w:tcPr>
-            <w:tcW w:w="367" w:type="pct"/>
-            <w:tcBorders>
-              <w:top w:val="single" w:sz="4" w:space="0" w:color="auto"/>
-              <w:left w:val="single" w:sz="4" w:space="0" w:color="auto"/>
-              <w:bottom w:val="single" w:sz="4" w:space="0" w:color="auto"/>
-              <w:right w:val="single" w:sz="4" w:space="0" w:color="auto"/>
-            </w:tcBorders>
-            <w:tcMar>
-              <w:top w:w="0" w:type="dxa"/>
-              <w:left w:w="45" w:type="dxa"/>
-              <w:bottom w:w="0" w:type="dxa"/>
-              <w:right w:w="45" w:type="dxa"/>
-            </w:tcMar>
-            <w:vAlign w:val="center"/>
-          </w:tcPr>
-          <w:p>
-            <w:pPr>
-              <w:spacing w:after="0" w:line="240" w:lineRule="auto"/>
-              <w:rPr>
-                <w:rFonts w:ascii="Times New Roman" w:eastAsia="Times New Roman" w:hAnsi="Times New Roman" w:cs="Times New Roman"/>
-                <w:kern w:val="0"/>
-                <w:sz w:val="26"/>
-                <w:szCs w:val="26"/>
-                <w14:ligatures w14:val="none"/>
-              </w:rPr>
-            </w:pPr>
-          </w:p>
-        </w:tc>
-        <w:tc>
-          <w:tcPr>
-            <w:tcW w:w="300" w:type="pct"/>
-            <w:tcBorders>
-              <w:top w:val="single" w:sz="4" w:space="0" w:color="auto"/>
-              <w:left w:val="single" w:sz="4" w:space="0" w:color="auto"/>
-              <w:bottom w:val="single" w:sz="4" w:space="0" w:color="auto"/>
-              <w:right w:val="single" w:sz="4" w:space="0" w:color="auto"/>
-            </w:tcBorders>
-            <w:tcMar>
-              <w:top w:w="0" w:type="dxa"/>
-              <w:left w:w="45" w:type="dxa"/>
-              <w:bottom w:w="0" w:type="dxa"/>
-              <w:right w:w="45" w:type="dxa"/>
-            </w:tcMar>
-            <w:vAlign w:val="center"/>
-          </w:tcPr>
-          <w:p>
-            <w:pPr>
-              <w:spacing w:after="0" w:line="240" w:lineRule="auto"/>
-              <w:jc w:val="center"/>
-              <w:rPr>
-                <w:rFonts w:ascii="Times New Roman" w:eastAsia="Times New Roman" w:hAnsi="Times New Roman" w:cs="Times New Roman"/>
-                <w:color w:val="001A33"/>
-                <w:kern w:val="0"/>
-                <w:sz w:val="26"/>
-                <w:szCs w:val="26"/>
-                <w14:ligatures w14:val="none"/>
-              </w:rPr>
-            </w:pPr>
-          </w:p>
-        </w:tc>
-        <w:tc>
-          <w:tcPr>
-            <w:tcW w:w="473" w:type="pct"/>
-            <w:tcBorders>
-              <w:top w:val="single" w:sz="4" w:space="0" w:color="auto"/>
-              <w:left w:val="single" w:sz="4" w:space="0" w:color="auto"/>
-              <w:bottom w:val="single" w:sz="4" w:space="0" w:color="auto"/>
-              <w:right w:val="single" w:sz="4" w:space="0" w:color="auto"/>
-            </w:tcBorders>
-            <w:tcMar>
-              <w:top w:w="0" w:type="dxa"/>
-              <w:left w:w="45" w:type="dxa"/>
-              <w:bottom w:w="0" w:type="dxa"/>
-              <w:right w:w="45" w:type="dxa"/>
-            </w:tcMar>
-            <w:vAlign w:val="center"/>
-          </w:tcPr>
-          <w:p>
-            <w:pPr>
-              <w:spacing w:after="0" w:line="240" w:lineRule="auto"/>
-              <w:rPr>
-                <w:rFonts w:ascii="Times New Roman" w:eastAsia="Times New Roman" w:hAnsi="Times New Roman" w:cs="Times New Roman"/>
-                <w:kern w:val="0"/>
-                <w:sz w:val="26"/>
-                <w:szCs w:val="26"/>
-                <w14:ligatures w14:val="none"/>
-              </w:rPr>
-            </w:pPr>
-          </w:p>
-        </w:tc>
-        <w:tc>
-          <w:tcPr>
-            <w:tcW w:w="485" w:type="pct"/>
-            <w:tcBorders>
-              <w:top w:val="single" w:sz="4" w:space="0" w:color="auto"/>
-              <w:left w:val="single" w:sz="4" w:space="0" w:color="auto"/>
-              <w:bottom w:val="single" w:sz="4" w:space="0" w:color="auto"/>
-              <w:right w:val="single" w:sz="4" w:space="0" w:color="auto"/>
-            </w:tcBorders>
-            <w:tcMar>
-              <w:top w:w="0" w:type="dxa"/>
-              <w:left w:w="45" w:type="dxa"/>
-              <w:bottom w:w="0" w:type="dxa"/>
-              <w:right w:w="45" w:type="dxa"/>
-            </w:tcMar>
-            <w:vAlign w:val="center"/>
-          </w:tcPr>
-          <w:p>
-            <w:pPr>
-              <w:spacing w:after="0" w:line="240" w:lineRule="auto"/>
-              <w:rPr>
-                <w:rFonts w:ascii="Times New Roman" w:eastAsia="Times New Roman" w:hAnsi="Times New Roman" w:cs="Times New Roman"/>
-                <w:kern w:val="0"/>
-                <w:sz w:val="26"/>
-                <w:szCs w:val="26"/>
-                <w14:ligatures w14:val="none"/>
-              </w:rPr>
-            </w:pPr>
-          </w:p>
-        </w:tc>
-        <w:tc>
-          <w:tcPr>
-            <w:tcW w:w="419" w:type="pct"/>
-            <w:tcBorders>
-              <w:top w:val="single" w:sz="4" w:space="0" w:color="auto"/>
-              <w:left w:val="single" w:sz="4" w:space="0" w:color="auto"/>
-              <w:bottom w:val="single" w:sz="4" w:space="0" w:color="auto"/>
-              <w:right w:val="single" w:sz="4" w:space="0" w:color="auto"/>
-            </w:tcBorders>
-            <w:tcMar>
-              <w:top w:w="0" w:type="dxa"/>
-              <w:left w:w="45" w:type="dxa"/>
-              <w:bottom w:w="0" w:type="dxa"/>
-              <w:right w:w="45" w:type="dxa"/>
-            </w:tcMar>
-            <w:vAlign w:val="center"/>
-          </w:tcPr>
-          <w:p>
-            <w:pPr>
-              <w:spacing w:after="0" w:line="240" w:lineRule="auto"/>
-              <w:jc w:val="center"/>
-              <w:rPr>
-                <w:rFonts w:ascii="Times New Roman" w:eastAsia="Times New Roman" w:hAnsi="Times New Roman" w:cs="Times New Roman"/>
-                <w:kern w:val="0"/>
-                <w:sz w:val="28"/>
-                <w:szCs w:val="28"/>
-                <w14:ligatures w14:val="none"/>
-              </w:rPr>
-            </w:pPr>
-          </w:p>
-        </w:tc>
-        <w:tc>
-          <w:tcPr>
-            <w:tcW w:w="392" w:type="pct"/>
-            <w:tcBorders>
-              <w:top w:val="single" w:sz="4" w:space="0" w:color="auto"/>
-              <w:left w:val="single" w:sz="4" w:space="0" w:color="auto"/>
-              <w:bottom w:val="single" w:sz="4" w:space="0" w:color="auto"/>
-              <w:right w:val="single" w:sz="4" w:space="0" w:color="auto"/>
-            </w:tcBorders>
-            <w:vAlign w:val="center"/>
-          </w:tcPr>
-          <w:p>
-            <w:pPr>
-              <w:spacing w:after="0" w:line="240" w:lineRule="auto"/>
-              <w:jc w:val="center"/>
-              <w:rPr>
-                <w:rFonts w:ascii="Times New Roman" w:eastAsia="Times New Roman" w:hAnsi="Times New Roman" w:cs="Times New Roman"/>
-                <w:kern w:val="0"/>
-                <w:sz w:val="28"/>
-                <w:szCs w:val="28"/>
-                <w14:ligatures w14:val="none"/>
-              </w:rPr>
-            </w:pPr>
-          </w:p>
-        </w:tc>
-        <w:tc>
-          <w:tcPr>
-            <w:tcW w:w="602" w:type="pct"/>
-            <w:tcBorders>
-              <w:top w:val="single" w:sz="4" w:space="0" w:color="auto"/>
-              <w:left w:val="single" w:sz="4" w:space="0" w:color="auto"/>
-              <w:bottom w:val="single" w:sz="4" w:space="0" w:color="auto"/>
-              <w:right w:val="single" w:sz="4" w:space="0" w:color="auto"/>
-            </w:tcBorders>
-            <w:tcMar>
-              <w:top w:w="0" w:type="dxa"/>
-              <w:left w:w="45" w:type="dxa"/>
-              <w:bottom w:w="0" w:type="dxa"/>
-              <w:right w:w="45" w:type="dxa"/>
-            </w:tcMar>
-            <w:vAlign w:val="center"/>
-          </w:tcPr>
-          <w:p>
-            <w:pPr>
-              <w:spacing w:after="0" w:line="240" w:lineRule="auto"/>
-              <w:jc w:val="center"/>
-              <w:rPr>
-                <w:rFonts w:ascii="Times New Roman" w:eastAsia="Times New Roman" w:hAnsi="Times New Roman" w:cs="Times New Roman"/>
-                <w:kern w:val="0"/>
-                <w:sz w:val="28"/>
-                <w:szCs w:val="28"/>
-                <w14:ligatures w14:val="none"/>
-              </w:rPr>
-            </w:pPr>
-          </w:p>
-        </w:tc>
-        <w:tc>
-          <w:tcPr>
-            <w:tcW w:w="602" w:type="pct"/>
-            <w:tcBorders>
-              <w:top w:val="single" w:sz="4" w:space="0" w:color="auto"/>
-              <w:left w:val="single" w:sz="4" w:space="0" w:color="auto"/>
-              <w:bottom w:val="single" w:sz="4" w:space="0" w:color="auto"/>
-              <w:right w:val="single" w:sz="4" w:space="0" w:color="auto"/>
-            </w:tcBorders>
-            <w:tcMar>
-              <w:top w:w="0" w:type="dxa"/>
-              <w:left w:w="45" w:type="dxa"/>
-              <w:bottom w:w="0" w:type="dxa"/>
-              <w:right w:w="45" w:type="dxa"/>
-            </w:tcMar>
-            <w:vAlign w:val="center"/>
-          </w:tcPr>
-          <w:p>
-            <w:pPr>
-              <w:spacing w:after="0" w:line="240" w:lineRule="auto"/>
-              <w:jc w:val="center"/>
-              <w:rPr>
-                <w:rFonts w:ascii="Times New Roman" w:eastAsia="Times New Roman" w:hAnsi="Times New Roman" w:cs="Times New Roman"/>
-                <w:kern w:val="0"/>
-                <w:sz w:val="28"/>
-                <w:szCs w:val="28"/>
-                <w14:ligatures w14:val="none"/>
-              </w:rPr>
-            </w:pPr>
-          </w:p>
-        </w:tc>
-        <w:tc>
-          <w:tcPr>
-            <w:tcW w:w="602" w:type="pct"/>
-            <w:tcBorders>
-              <w:top w:val="single" w:sz="4" w:space="0" w:color="auto"/>
-              <w:left w:val="single" w:sz="4" w:space="0" w:color="auto"/>
-              <w:bottom w:val="single" w:sz="4" w:space="0" w:color="auto"/>
-              <w:right w:val="single" w:sz="4" w:space="0" w:color="auto"/>
-            </w:tcBorders>
-            <w:tcMar>
-              <w:top w:w="0" w:type="dxa"/>
-              <w:left w:w="45" w:type="dxa"/>
-              <w:bottom w:w="0" w:type="dxa"/>
-              <w:right w:w="45" w:type="dxa"/>
-            </w:tcMar>
-            <w:vAlign w:val="center"/>
-          </w:tcPr>
-          <w:p>
-            <w:pPr>
-              <w:spacing w:after="0" w:line="240" w:lineRule="auto"/>
-              <w:jc w:val="center"/>
-              <w:rPr>
-                <w:rFonts w:ascii="Times New Roman" w:eastAsia="Times New Roman" w:hAnsi="Times New Roman" w:cs="Times New Roman"/>
-                <w:kern w:val="0"/>
-                <w:sz w:val="28"/>
-                <w:szCs w:val="28"/>
-                <w14:ligatures w14:val="none"/>
-              </w:rPr>
-            </w:pPr>
-          </w:p>
-        </w:tc>
-        <w:tc>
-          <w:tcPr>
-            <w:tcW w:w="479" w:type="pct"/>
-            <w:tcBorders>
-              <w:top w:val="single" w:sz="4" w:space="0" w:color="auto"/>
-              <w:left w:val="single" w:sz="4" w:space="0" w:color="auto"/>
-              <w:bottom w:val="single" w:sz="4" w:space="0" w:color="auto"/>
-              <w:right w:val="single" w:sz="4" w:space="0" w:color="auto"/>
-            </w:tcBorders>
-            <w:tcMar>
-              <w:top w:w="0" w:type="dxa"/>
-              <w:left w:w="45" w:type="dxa"/>
-              <w:bottom w:w="0" w:type="dxa"/>
-              <w:right w:w="45" w:type="dxa"/>
-            </w:tcMar>
-            <w:vAlign w:val="center"/>
-          </w:tcPr>
-          <w:p>
-            <w:pPr>
-              <w:spacing w:after="0" w:line="240" w:lineRule="auto"/>
-              <w:jc w:val="center"/>
-              <w:rPr>
-                <w:rFonts w:ascii="Times New Roman" w:eastAsia="Times New Roman" w:hAnsi="Times New Roman" w:cs="Times New Roman"/>
-                <w:b/>
-                <w:bCs/>
-                <w:kern w:val="0"/>
-                <w:sz w:val="26"/>
-                <w:szCs w:val="26"/>
-                <w14:ligatures w14:val="none"/>
-              </w:rPr>
-            </w:pPr>
-          </w:p>
-        </w:tc>
-        <w:tc>
-          <w:tcPr>
-            <w:tcW w:w="151" w:type="pct"/>
-            <w:tcBorders>
-              <w:top w:val="single" w:sz="4" w:space="0" w:color="auto"/>
-              <w:left w:val="single" w:sz="4" w:space="0" w:color="auto"/>
-              <w:bottom w:val="single" w:sz="4" w:space="0" w:color="auto"/>
-              <w:right w:val="single" w:sz="4" w:space="0" w:color="auto"/>
-            </w:tcBorders>
-            <w:tcMar>
-              <w:top w:w="0" w:type="dxa"/>
-              <w:left w:w="45" w:type="dxa"/>
-              <w:bottom w:w="0" w:type="dxa"/>
-              <w:right w:w="45" w:type="dxa"/>
-            </w:tcMar>
-            <w:vAlign w:val="center"/>
-          </w:tcPr>
-          <w:p>
-            <w:pPr>
-              <w:spacing w:after="0" w:line="240" w:lineRule="auto"/>
-              <w:jc w:val="center"/>
-              <w:rPr>
-                <w:rFonts w:ascii="Times New Roman" w:eastAsia="Times New Roman" w:hAnsi="Times New Roman" w:cs="Times New Roman"/>
-                <w:kern w:val="0"/>
-                <w:sz w:val="26"/>
-                <w:szCs w:val="26"/>
-                <w14:ligatures w14:val="none"/>
-              </w:rPr>
-            </w:pPr>
+              <w:t>{final_score_text</w:t>
+            </w:r>
+            <w:r>
+              <w:rPr>
+                <w:rFonts w:ascii="Times New Roman" w:eastAsia="Times New Roman" w:hAnsi="Times New Roman" w:cs="Times New Roman"/>
+                <w:kern w:val="0"/>
+                <w:sz w:val="26"/>
+                <w:szCs w:val="26"/>
+                <w14:ligatures w14:val="none"/>
+              </w:rPr>
+              <w:t>}</w:t>
+            </w:r>
+            <w:r>
+              <w:rPr>
+                <w:rFonts w:ascii="Times New Roman" w:eastAsia="Times New Roman" w:hAnsi="Times New Roman" w:cs="Times New Roman"/>
+                <w:kern w:val="0"/>
+                <w:sz w:val="26"/>
+                <w:szCs w:val="26"/>
+                <w14:ligatures w14:val="none"/>
+              </w:rPr>
+              <w:t>{/students}</w:t>
+            </w:r>
           </w:p>
         </w:tc>
       </w:tr>
@@ -6404,6 +5019,7 @@
   <w:style w:type="character" w:default="1" w:styleId="DefaultParagraphFont">
     <w:name w:val="Default Paragraph Font"/>
     <w:uiPriority w:val="1"/>
+    <w:semiHidden/>
     <w:unhideWhenUsed/>
   </w:style>
   <w:style w:type="table" w:default="1" w:styleId="TableNormal">

</xml_diff>